<commit_message>
Update UML based on teachers recommendations
</commit_message>
<xml_diff>
--- a/e-commerce/E-Commerce.docx
+++ b/e-commerce/E-Commerce.docx
@@ -163,64 +163,6 @@
           </w:tcPr>
           <w:p>
             <w:r>
-              <w:t>Customer</w:t>
-            </w:r>
-          </w:p>
-        </w:tc>
-        <w:tc>
-          <w:tcPr>
-            <w:tcW w:w="1788" w:type="dxa"/>
-          </w:tcPr>
-          <w:p>
-            <w:r>
-              <w:t>Customer</w:t>
-            </w:r>
-          </w:p>
-        </w:tc>
-        <w:tc>
-          <w:tcPr>
-            <w:tcW w:w="1772" w:type="dxa"/>
-          </w:tcPr>
-          <w:p>
-            <w:pPr>
-              <w:jc w:val="center"/>
-            </w:pPr>
-          </w:p>
-        </w:tc>
-        <w:tc>
-          <w:tcPr>
-            <w:tcW w:w="1796" w:type="dxa"/>
-          </w:tcPr>
-          <w:p>
-            <w:pPr>
-              <w:jc w:val="center"/>
-            </w:pPr>
-            <w:r>
-              <w:t>*</w:t>
-            </w:r>
-          </w:p>
-        </w:tc>
-        <w:tc>
-          <w:tcPr>
-            <w:tcW w:w="1789" w:type="dxa"/>
-          </w:tcPr>
-          <w:p>
-            <w:pPr>
-              <w:jc w:val="center"/>
-            </w:pPr>
-          </w:p>
-        </w:tc>
-      </w:tr>
-      <w:tr>
-        <w:trPr>
-          <w:trHeight w:val="522"/>
-        </w:trPr>
-        <w:tc>
-          <w:tcPr>
-            <w:tcW w:w="1917" w:type="dxa"/>
-          </w:tcPr>
-          <w:p>
-            <w:r>
               <w:t>Street</w:t>
             </w:r>
           </w:p>
@@ -608,6 +550,9 @@
             <w:r>
               <w:t>Address</w:t>
             </w:r>
+            <w:r>
+              <w:t>es</w:t>
+            </w:r>
           </w:p>
         </w:tc>
         <w:tc>
@@ -616,7 +561,7 @@
           </w:tcPr>
           <w:p>
             <w:r>
-              <w:t>Address</w:t>
+              <w:t>List&lt;Address&gt;</w:t>
             </w:r>
           </w:p>
         </w:tc>
@@ -791,6 +736,9 @@
             <w:r>
               <w:t>Password</w:t>
             </w:r>
+            <w:r>
+              <w:t>Hash</w:t>
+            </w:r>
           </w:p>
         </w:tc>
         <w:tc>
@@ -849,6 +797,9 @@
             <w:r>
               <w:t>Phone</w:t>
             </w:r>
+            <w:r>
+              <w:t>Number</w:t>
+            </w:r>
           </w:p>
         </w:tc>
         <w:tc>
@@ -870,7 +821,7 @@
               <w:jc w:val="center"/>
             </w:pPr>
             <w:r>
-              <w:t>15</w:t>
+              <w:t>20</w:t>
             </w:r>
           </w:p>
         </w:tc>
@@ -1119,7 +1070,7 @@
           </w:tcPr>
           <w:p>
             <w:r>
-              <w:t>Image</w:t>
+              <w:t>Price</w:t>
             </w:r>
           </w:p>
         </w:tc>
@@ -1129,7 +1080,7 @@
           </w:tcPr>
           <w:p>
             <w:r>
-              <w:t>VarBinary</w:t>
+              <w:t>Decimal</w:t>
             </w:r>
           </w:p>
         </w:tc>
@@ -1141,9 +1092,6 @@
             <w:pPr>
               <w:jc w:val="center"/>
             </w:pPr>
-            <w:r>
-              <w:t>Max</w:t>
-            </w:r>
           </w:p>
         </w:tc>
         <w:tc>
@@ -1167,9 +1115,6 @@
             <w:pPr>
               <w:jc w:val="center"/>
             </w:pPr>
-            <w:r>
-              <w:t>*</w:t>
-            </w:r>
           </w:p>
         </w:tc>
       </w:tr>
@@ -1183,7 +1128,7 @@
           </w:tcPr>
           <w:p>
             <w:r>
-              <w:t>Price</w:t>
+              <w:t>StockQuantity</w:t>
             </w:r>
           </w:p>
         </w:tc>
@@ -1193,7 +1138,7 @@
           </w:tcPr>
           <w:p>
             <w:r>
-              <w:t>Decimal</w:t>
+              <w:t>Int</w:t>
             </w:r>
           </w:p>
         </w:tc>
@@ -1241,7 +1186,7 @@
           </w:tcPr>
           <w:p>
             <w:r>
-              <w:t>StockQuantity</w:t>
+              <w:t>Category</w:t>
             </w:r>
           </w:p>
         </w:tc>
@@ -1251,7 +1196,7 @@
           </w:tcPr>
           <w:p>
             <w:r>
-              <w:t>Int</w:t>
+              <w:t>Category</w:t>
             </w:r>
           </w:p>
         </w:tc>
@@ -1263,67 +1208,6 @@
             <w:pPr>
               <w:jc w:val="center"/>
             </w:pPr>
-          </w:p>
-        </w:tc>
-        <w:tc>
-          <w:tcPr>
-            <w:tcW w:w="1796" w:type="dxa"/>
-          </w:tcPr>
-          <w:p>
-            <w:pPr>
-              <w:jc w:val="center"/>
-            </w:pPr>
-            <w:r>
-              <w:t>*</w:t>
-            </w:r>
-          </w:p>
-        </w:tc>
-        <w:tc>
-          <w:tcPr>
-            <w:tcW w:w="1789" w:type="dxa"/>
-          </w:tcPr>
-          <w:p>
-            <w:pPr>
-              <w:jc w:val="center"/>
-            </w:pPr>
-          </w:p>
-        </w:tc>
-      </w:tr>
-      <w:tr>
-        <w:trPr>
-          <w:trHeight w:val="522"/>
-        </w:trPr>
-        <w:tc>
-          <w:tcPr>
-            <w:tcW w:w="1917" w:type="dxa"/>
-          </w:tcPr>
-          <w:p>
-            <w:r>
-              <w:t>Category</w:t>
-            </w:r>
-          </w:p>
-        </w:tc>
-        <w:tc>
-          <w:tcPr>
-            <w:tcW w:w="1788" w:type="dxa"/>
-          </w:tcPr>
-          <w:p>
-            <w:r>
-              <w:t>String</w:t>
-            </w:r>
-          </w:p>
-        </w:tc>
-        <w:tc>
-          <w:tcPr>
-            <w:tcW w:w="1772" w:type="dxa"/>
-          </w:tcPr>
-          <w:p>
-            <w:pPr>
-              <w:jc w:val="center"/>
-            </w:pPr>
-            <w:r>
-              <w:t>100</w:t>
-            </w:r>
           </w:p>
         </w:tc>
         <w:tc>
@@ -1501,7 +1385,6 @@
           </w:tcPr>
           <w:p>
             <w:r>
-              <w:lastRenderedPageBreak/>
               <w:t>Quantity</w:t>
             </w:r>
           </w:p>
@@ -1552,7 +1435,7 @@
       </w:tr>
       <w:tr>
         <w:trPr>
-          <w:trHeight w:val="522"/>
+          <w:trHeight w:val="553"/>
         </w:trPr>
         <w:tc>
           <w:tcPr>
@@ -1622,6 +1505,7 @@
               <w:jc w:val="center"/>
             </w:pPr>
             <w:r>
+              <w:lastRenderedPageBreak/>
               <w:t>Order</w:t>
             </w:r>
           </w:p>
@@ -2275,6 +2159,147 @@
             </w:pPr>
             <w:r>
               <w:t>50</w:t>
+            </w:r>
+          </w:p>
+        </w:tc>
+        <w:tc>
+          <w:tcPr>
+            <w:tcW w:w="1796" w:type="dxa"/>
+          </w:tcPr>
+          <w:p>
+            <w:pPr>
+              <w:jc w:val="center"/>
+            </w:pPr>
+            <w:r>
+              <w:t>*</w:t>
+            </w:r>
+          </w:p>
+        </w:tc>
+        <w:tc>
+          <w:tcPr>
+            <w:tcW w:w="1789" w:type="dxa"/>
+          </w:tcPr>
+          <w:p>
+            <w:pPr>
+              <w:jc w:val="center"/>
+            </w:pPr>
+          </w:p>
+        </w:tc>
+      </w:tr>
+      <w:tr>
+        <w:trPr>
+          <w:trHeight w:val="522"/>
+        </w:trPr>
+        <w:tc>
+          <w:tcPr>
+            <w:tcW w:w="9062" w:type="dxa"/>
+            <w:gridSpan w:val="5"/>
+          </w:tcPr>
+          <w:p>
+            <w:pPr>
+              <w:jc w:val="center"/>
+            </w:pPr>
+            <w:r>
+              <w:t>Category</w:t>
+            </w:r>
+          </w:p>
+        </w:tc>
+      </w:tr>
+      <w:tr>
+        <w:trPr>
+          <w:trHeight w:val="522"/>
+        </w:trPr>
+        <w:tc>
+          <w:tcPr>
+            <w:tcW w:w="1917" w:type="dxa"/>
+          </w:tcPr>
+          <w:p>
+            <w:r>
+              <w:t>ID</w:t>
+            </w:r>
+          </w:p>
+        </w:tc>
+        <w:tc>
+          <w:tcPr>
+            <w:tcW w:w="1788" w:type="dxa"/>
+          </w:tcPr>
+          <w:p>
+            <w:r>
+              <w:t>Int</w:t>
+            </w:r>
+          </w:p>
+        </w:tc>
+        <w:tc>
+          <w:tcPr>
+            <w:tcW w:w="1772" w:type="dxa"/>
+          </w:tcPr>
+          <w:p>
+            <w:pPr>
+              <w:jc w:val="center"/>
+            </w:pPr>
+          </w:p>
+        </w:tc>
+        <w:tc>
+          <w:tcPr>
+            <w:tcW w:w="1796" w:type="dxa"/>
+          </w:tcPr>
+          <w:p>
+            <w:pPr>
+              <w:jc w:val="center"/>
+            </w:pPr>
+            <w:r>
+              <w:t>*</w:t>
+            </w:r>
+          </w:p>
+        </w:tc>
+        <w:tc>
+          <w:tcPr>
+            <w:tcW w:w="1789" w:type="dxa"/>
+          </w:tcPr>
+          <w:p>
+            <w:pPr>
+              <w:jc w:val="center"/>
+            </w:pPr>
+            <w:r>
+              <w:t>*</w:t>
+            </w:r>
+          </w:p>
+        </w:tc>
+      </w:tr>
+      <w:tr>
+        <w:trPr>
+          <w:trHeight w:val="522"/>
+        </w:trPr>
+        <w:tc>
+          <w:tcPr>
+            <w:tcW w:w="1917" w:type="dxa"/>
+          </w:tcPr>
+          <w:p>
+            <w:r>
+              <w:t>Name</w:t>
+            </w:r>
+          </w:p>
+        </w:tc>
+        <w:tc>
+          <w:tcPr>
+            <w:tcW w:w="1788" w:type="dxa"/>
+          </w:tcPr>
+          <w:p>
+            <w:r>
+              <w:t>String</w:t>
+            </w:r>
+          </w:p>
+        </w:tc>
+        <w:tc>
+          <w:tcPr>
+            <w:tcW w:w="1772" w:type="dxa"/>
+          </w:tcPr>
+          <w:p>
+            <w:pPr>
+              <w:jc w:val="center"/>
+            </w:pPr>
+            <w:r>
+              <w:t>20</w:t>
             </w:r>
           </w:p>
         </w:tc>
@@ -3755,6 +3780,23 @@
 </file>
 
 <file path=customXml/item1.xml><?xml version="1.0" encoding="utf-8"?>
+<p:properties xmlns:p="http://schemas.microsoft.com/office/2006/metadata/properties" xmlns:xsi="http://www.w3.org/2001/XMLSchema-instance" xmlns:pc="http://schemas.microsoft.com/office/infopath/2007/PartnerControls">
+  <documentManagement>
+    <_activity xmlns="ace3d3e9-784d-425f-9068-8c08283ddc4c" xsi:nil="true"/>
+  </documentManagement>
+</p:properties>
+</file>
+
+<file path=customXml/item2.xml><?xml version="1.0" encoding="utf-8"?>
+<?mso-contentType ?>
+<FormTemplates xmlns="http://schemas.microsoft.com/sharepoint/v3/contenttype/forms">
+  <Display>DocumentLibraryForm</Display>
+  <Edit>DocumentLibraryForm</Edit>
+  <New>DocumentLibraryForm</New>
+</FormTemplates>
+</file>
+
+<file path=customXml/item3.xml><?xml version="1.0" encoding="utf-8"?>
 <ct:contentTypeSchema xmlns:ct="http://schemas.microsoft.com/office/2006/metadata/contentType" xmlns:ma="http://schemas.microsoft.com/office/2006/metadata/properties/metaAttributes" ct:_="" ma:_="" ma:contentTypeName="Document" ma:contentTypeID="0x0101001C0AF13862FA4E428BE86988022E4550" ma:contentTypeVersion="10" ma:contentTypeDescription="Create a new document." ma:contentTypeScope="" ma:versionID="423b08aa2c226dd3c0f1f2d822dbf503">
   <xsd:schema xmlns:xsd="http://www.w3.org/2001/XMLSchema" xmlns:xs="http://www.w3.org/2001/XMLSchema" xmlns:p="http://schemas.microsoft.com/office/2006/metadata/properties" xmlns:ns3="ace3d3e9-784d-425f-9068-8c08283ddc4c" targetNamespace="http://schemas.microsoft.com/office/2006/metadata/properties" ma:root="true" ma:fieldsID="ca47c671186e72d7841f254209e0a0ff" ns3:_="">
     <xsd:import namespace="ace3d3e9-784d-425f-9068-8c08283ddc4c"/>
@@ -3936,24 +3978,25 @@
 </ct:contentTypeSchema>
 </file>
 
-<file path=customXml/item2.xml><?xml version="1.0" encoding="utf-8"?>
-<?mso-contentType ?>
-<FormTemplates xmlns="http://schemas.microsoft.com/sharepoint/v3/contenttype/forms">
-  <Display>DocumentLibraryForm</Display>
-  <Edit>DocumentLibraryForm</Edit>
-  <New>DocumentLibraryForm</New>
-</FormTemplates>
+<file path=customXml/itemProps1.xml><?xml version="1.0" encoding="utf-8"?>
+<ds:datastoreItem xmlns:ds="http://schemas.openxmlformats.org/officeDocument/2006/customXml" ds:itemID="{A989733A-3142-41FA-B014-653FBE529D84}">
+  <ds:schemaRefs>
+    <ds:schemaRef ds:uri="http://schemas.microsoft.com/office/2006/metadata/properties"/>
+    <ds:schemaRef ds:uri="http://schemas.microsoft.com/office/infopath/2007/PartnerControls"/>
+    <ds:schemaRef ds:uri="ace3d3e9-784d-425f-9068-8c08283ddc4c"/>
+  </ds:schemaRefs>
+</ds:datastoreItem>
 </file>
 
-<file path=customXml/item3.xml><?xml version="1.0" encoding="utf-8"?>
-<p:properties xmlns:p="http://schemas.microsoft.com/office/2006/metadata/properties" xmlns:xsi="http://www.w3.org/2001/XMLSchema-instance" xmlns:pc="http://schemas.microsoft.com/office/infopath/2007/PartnerControls">
-  <documentManagement>
-    <_activity xmlns="ace3d3e9-784d-425f-9068-8c08283ddc4c" xsi:nil="true"/>
-  </documentManagement>
-</p:properties>
+<file path=customXml/itemProps2.xml><?xml version="1.0" encoding="utf-8"?>
+<ds:datastoreItem xmlns:ds="http://schemas.openxmlformats.org/officeDocument/2006/customXml" ds:itemID="{62E608F5-A720-48DC-B24D-C9141F81979E}">
+  <ds:schemaRefs>
+    <ds:schemaRef ds:uri="http://schemas.microsoft.com/sharepoint/v3/contenttype/forms"/>
+  </ds:schemaRefs>
+</ds:datastoreItem>
 </file>
 
-<file path=customXml/itemProps1.xml><?xml version="1.0" encoding="utf-8"?>
+<file path=customXml/itemProps3.xml><?xml version="1.0" encoding="utf-8"?>
 <ds:datastoreItem xmlns:ds="http://schemas.openxmlformats.org/officeDocument/2006/customXml" ds:itemID="{E3BC1310-3C22-4873-9A96-13EBBA49CAD7}">
   <ds:schemaRefs>
     <ds:schemaRef ds:uri="http://schemas.microsoft.com/office/2006/metadata/contentType"/>
@@ -3969,22 +4012,4 @@
     <ds:schemaRef ds:uri="http://schemas.microsoft.com/internal/obd"/>
   </ds:schemaRefs>
 </ds:datastoreItem>
-</file>
-
-<file path=customXml/itemProps2.xml><?xml version="1.0" encoding="utf-8"?>
-<ds:datastoreItem xmlns:ds="http://schemas.openxmlformats.org/officeDocument/2006/customXml" ds:itemID="{62E608F5-A720-48DC-B24D-C9141F81979E}">
-  <ds:schemaRefs>
-    <ds:schemaRef ds:uri="http://schemas.microsoft.com/sharepoint/v3/contenttype/forms"/>
-  </ds:schemaRefs>
-</ds:datastoreItem>
-</file>
-
-<file path=customXml/itemProps3.xml><?xml version="1.0" encoding="utf-8"?>
-<ds:datastoreItem xmlns:ds="http://schemas.openxmlformats.org/officeDocument/2006/customXml" ds:itemID="{A989733A-3142-41FA-B014-653FBE529D84}">
-  <ds:schemaRefs>
-    <ds:schemaRef ds:uri="http://schemas.microsoft.com/office/2006/metadata/properties"/>
-    <ds:schemaRef ds:uri="http://schemas.microsoft.com/office/infopath/2007/PartnerControls"/>
-    <ds:schemaRef ds:uri="ace3d3e9-784d-425f-9068-8c08283ddc4c"/>
-  </ds:schemaRefs>
-</ds:datastoreItem>
 </file>
</xml_diff>